<commit_message>
Changed database link from zenodo to UoE FTP
</commit_message>
<xml_diff>
--- a/guide_to_docker_images.docx
+++ b/guide_to_docker_images.docx
@@ -600,6 +600,43 @@
           <w:lang w:val="en-US"/>
         </w:rPr>
         <w:t>?</w:t>
+      </w:r>
+    </w:p>
+    <w:p>
+      <w:pPr>
+        <w:rPr>
+          <w:lang w:val="en-US"/>
+        </w:rPr>
+      </w:pPr>
+      <w:r>
+        <w:rPr>
+          <w:lang w:val="en-US"/>
+        </w:rPr>
+        <w:t>* If the pre-built image fails due to architecture mismatch, rebuild</w:t>
+      </w:r>
+      <w:r>
+        <w:rPr>
+          <w:lang w:val="en-US"/>
+        </w:rPr>
+        <w:t>ing</w:t>
+      </w:r>
+      <w:r>
+        <w:rPr>
+          <w:lang w:val="en-US"/>
+        </w:rPr>
+        <w:t xml:space="preserve"> it locally on the target system</w:t>
+      </w:r>
+      <w:r>
+        <w:rPr>
+          <w:lang w:val="en-US"/>
+        </w:rPr>
+        <w:t xml:space="preserve"> is a good idea</w:t>
+      </w:r>
+      <w:r>
+        <w:rPr>
+          <w:lang w:val="en-US"/>
+        </w:rPr>
+        <w:t>.</w:t>
       </w:r>
     </w:p>
     <w:p>
@@ -1448,7 +1485,6 @@
         </w:tabs>
       </w:pPr>
       <w:r>
-        <w:lastRenderedPageBreak/>
         <w:t xml:space="preserve">Conda installs programs from repositories that are called channels. These are remote locations from where </w:t>
       </w:r>
       <w:proofErr w:type="spellStart"/>
@@ -2302,6 +2338,7 @@
         <w:rPr>
           <w:lang w:val="en-US"/>
         </w:rPr>
+        <w:lastRenderedPageBreak/>
         <w:t>Create a profile on Docker Hub</w:t>
       </w:r>
       <w:r>
@@ -2335,7 +2372,6 @@
         <w:rPr>
           <w:lang w:val="en-US"/>
         </w:rPr>
-        <w:lastRenderedPageBreak/>
         <w:t xml:space="preserve">Install Docker on your system </w:t>
       </w:r>
     </w:p>

</xml_diff>